<commit_message>
pipeline-v6: tune reference-gost.docx to ГОСТ 7.32 + delta measurement
- tune-reference-doc.ts: JSZip patcher — margins 20/10/20/30mm, Times 14pt,
  line 1.5, indent 12.5mm, Heading1 centered+pageBreak, docDefaults override
- measure-delta.ts: runs orchestrator on golden raw docs, prints score delta
- reference-gost.docx repacked with tuned styles
- v6 scores 86/90 on 2 raw golden docs (baseline avg 76)
- 1 doc timed out at 30s pandoc limit — large-doc handling is post-MVP
</commit_message>
<xml_diff>
--- a/scripts/pipeline-v6/spike-pandoc/reference-gost.docx
+++ b/scripts/pipeline-v6/spike-pandoc/reference-gost.docx
@@ -314,6 +314,7 @@
       </w:r>
     </w:p>
     <w:sectPr>
+      <w:pgMar w:top="1134" w:right="567" w:bottom="1134" w:left="1701" w:header="720" w:footer="720" w:gutter="0"/>
       <w:footnotePr>
         <w:numRestart w:val="eachSect"/>
       </w:footnotePr>
@@ -485,31 +486,45 @@
   <w:docDefaults>
     <w:rPrDefault>
       <w:rPr>
-        <w:rFonts w:asciiTheme="minorHAnsi" w:eastAsiaTheme="minorEastAsia" w:hAnsiTheme="minorHAnsi" w:cstheme="minorBidi"/>
-        <w:sz w:val="24"/>
-        <w:szCs w:val="24"/>
-        <w:lang w:val="en-US" w:eastAsia="zh-CN" w:bidi="ar-SA"/>
+        <w:rFonts w:ascii="Times New Roman" w:hAnsi="Times New Roman" w:cs="Times New Roman" w:eastAsia="Times New Roman"/>
+        <w:sz w:val="28"/>
+        <w:szCs w:val="28"/>
+        <w:lang w:val="ru-RU"/>
       </w:rPr>
     </w:rPrDefault>
     <w:pPrDefault>
       <w:pPr>
-        <w:spacing w:after="200"/>
+        <w:spacing w:line="360" w:lineRule="auto"/>
       </w:pPr>
     </w:pPrDefault>
   </w:docDefaults>
   <w:latentStyles w:defLockedState="0" w:defUIPriority="0" w:defSemiHidden="0" w:defUnhideWhenUsed="0" w:defQFormat="0" w:count="276"/>
   <w:style w:type="paragraph" w:default="1" w:styleId="Normal">
     <w:name w:val="Normal"/>
-    <w:qFormat/>
+    <w:pPr>
+      <w:spacing w:line="360" w:lineRule="auto" w:before="0" w:after="0"/>
+      <w:ind w:firstLine="708"/>
+      <w:jc w:val="both"/>
+    </w:pPr>
+    <w:rPr>
+      <w:rFonts w:ascii="Times New Roman" w:hAnsi="Times New Roman" w:cs="Times New Roman" w:eastAsia="Times New Roman"/>
+      <w:sz w:val="28"/>
+      <w:szCs w:val="28"/>
+    </w:rPr>
   </w:style>
   <w:style w:type="paragraph" w:styleId="BodyText">
     <w:name w:val="Body Text"/>
     <w:basedOn w:val="Normal"/>
-    <w:link w:val="BodyTextChar"/>
-    <w:qFormat/>
-    <w:pPr>
-      <w:spacing w:before="180" w:after="180"/>
-    </w:pPr>
+    <w:pPr>
+      <w:spacing w:line="360" w:lineRule="auto" w:before="0" w:after="0"/>
+      <w:ind w:firstLine="708"/>
+      <w:jc w:val="both"/>
+    </w:pPr>
+    <w:rPr>
+      <w:rFonts w:ascii="Times New Roman" w:hAnsi="Times New Roman" w:cs="Times New Roman" w:eastAsia="Times New Roman"/>
+      <w:sz w:val="28"/>
+      <w:szCs w:val="28"/>
+    </w:rPr>
   </w:style>
   <w:style w:type="paragraph" w:customStyle="1" w:styleId="FirstParagraph">
     <w:name w:val="First Paragraph"/>
@@ -661,66 +676,53 @@
   <w:style w:type="paragraph" w:styleId="Heading1">
     <w:name w:val="heading 1"/>
     <w:basedOn w:val="Normal"/>
-    <w:next w:val="BodyText"/>
-    <w:link w:val="Heading1Char"/>
-    <w:uiPriority w:val="9"/>
-    <w:qFormat/>
-    <w:rsid w:val="00A10FD9"/>
-    <w:pPr>
-      <w:keepNext/>
-      <w:keepLines/>
-      <w:spacing w:before="360" w:after="80"/>
+    <w:pPr>
+      <w:pageBreakBefore/>
+      <w:spacing w:line="360" w:lineRule="auto" w:before="240" w:after="240"/>
+      <w:ind w:firstLine="0"/>
+      <w:jc w:val="center"/>
       <w:outlineLvl w:val="0"/>
     </w:pPr>
     <w:rPr>
-      <w:rFonts w:asciiTheme="majorHAnsi" w:eastAsiaTheme="majorEastAsia" w:hAnsiTheme="majorHAnsi" w:cstheme="majorBidi"/>
-      <w:color w:val="0F4761" w:themeColor="accent1" w:themeShade="BF"/>
-      <w:sz w:val="40"/>
-      <w:szCs w:val="40"/>
+      <w:rFonts w:ascii="Times New Roman" w:hAnsi="Times New Roman" w:cs="Times New Roman" w:eastAsia="Times New Roman"/>
+      <w:b/>
+      <w:bCs/>
+      <w:caps/>
+      <w:sz w:val="28"/>
+      <w:szCs w:val="28"/>
     </w:rPr>
   </w:style>
   <w:style w:type="paragraph" w:styleId="Heading2">
     <w:name w:val="heading 2"/>
     <w:basedOn w:val="Normal"/>
-    <w:next w:val="BodyText"/>
-    <w:link w:val="Heading2Char"/>
-    <w:uiPriority w:val="9"/>
-    <w:semiHidden/>
-    <w:unhideWhenUsed/>
-    <w:qFormat/>
-    <w:rsid w:val="00A10FD9"/>
-    <w:pPr>
-      <w:keepNext/>
-      <w:keepLines/>
-      <w:spacing w:before="160" w:after="80"/>
+    <w:pPr>
+      <w:spacing w:line="360" w:lineRule="auto" w:before="240" w:after="120"/>
+      <w:ind w:firstLine="708"/>
+      <w:jc w:val="both"/>
       <w:outlineLvl w:val="1"/>
     </w:pPr>
     <w:rPr>
-      <w:rFonts w:asciiTheme="majorHAnsi" w:eastAsiaTheme="majorEastAsia" w:hAnsiTheme="majorHAnsi" w:cstheme="majorBidi"/>
-      <w:color w:val="0F4761" w:themeColor="accent1" w:themeShade="BF"/>
-      <w:sz w:val="32"/>
-      <w:szCs w:val="32"/>
+      <w:rFonts w:ascii="Times New Roman" w:hAnsi="Times New Roman" w:cs="Times New Roman" w:eastAsia="Times New Roman"/>
+      <w:b/>
+      <w:bCs/>
+      <w:sz w:val="28"/>
+      <w:szCs w:val="28"/>
     </w:rPr>
   </w:style>
   <w:style w:type="paragraph" w:styleId="Heading3">
     <w:name w:val="heading 3"/>
     <w:basedOn w:val="Normal"/>
-    <w:next w:val="BodyText"/>
-    <w:link w:val="Heading3Char"/>
-    <w:uiPriority w:val="9"/>
-    <w:semiHidden/>
-    <w:unhideWhenUsed/>
-    <w:qFormat/>
-    <w:rsid w:val="00A10FD9"/>
-    <w:pPr>
-      <w:keepNext/>
-      <w:keepLines/>
-      <w:spacing w:before="160" w:after="80"/>
+    <w:pPr>
+      <w:spacing w:line="360" w:lineRule="auto" w:before="240" w:after="120"/>
+      <w:ind w:firstLine="708"/>
+      <w:jc w:val="both"/>
       <w:outlineLvl w:val="2"/>
     </w:pPr>
     <w:rPr>
-      <w:rFonts w:eastAsiaTheme="majorEastAsia" w:cstheme="majorBidi"/>
-      <w:color w:val="0F4761" w:themeColor="accent1" w:themeShade="BF"/>
+      <w:rFonts w:ascii="Times New Roman" w:hAnsi="Times New Roman" w:cs="Times New Roman" w:eastAsia="Times New Roman"/>
+      <w:b/>
+      <w:bCs/>
+      <w:i/>
       <w:sz w:val="28"/>
       <w:szCs w:val="28"/>
     </w:rPr>

</xml_diff>

<commit_message>
chore(pipeline-v6): rebuild reference-gost.docx with Table borders
</commit_message>
<xml_diff>
--- a/scripts/pipeline-v6/spike-pandoc/reference-gost.docx
+++ b/scripts/pipeline-v6/spike-pandoc/reference-gost.docx
@@ -503,7 +503,7 @@
     <w:name w:val="Normal"/>
     <w:pPr>
       <w:spacing w:line="360" w:lineRule="auto" w:before="0" w:after="0"/>
-      <w:ind w:firstLine="708"/>
+      <w:ind w:firstLine="709"/>
       <w:jc w:val="both"/>
     </w:pPr>
     <w:rPr>
@@ -517,7 +517,7 @@
     <w:basedOn w:val="Normal"/>
     <w:pPr>
       <w:spacing w:line="360" w:lineRule="auto" w:before="0" w:after="0"/>
-      <w:ind w:firstLine="708"/>
+      <w:ind w:firstLine="709"/>
       <w:jc w:val="both"/>
     </w:pPr>
     <w:rPr>
@@ -697,7 +697,7 @@
     <w:basedOn w:val="Normal"/>
     <w:pPr>
       <w:spacing w:line="360" w:lineRule="auto" w:before="240" w:after="120"/>
-      <w:ind w:firstLine="708"/>
+      <w:ind w:firstLine="709"/>
       <w:jc w:val="both"/>
       <w:outlineLvl w:val="1"/>
     </w:pPr>
@@ -714,7 +714,7 @@
     <w:basedOn w:val="Normal"/>
     <w:pPr>
       <w:spacing w:line="360" w:lineRule="auto" w:before="240" w:after="120"/>
-      <w:ind w:firstLine="708"/>
+      <w:ind w:firstLine="709"/>
       <w:jc w:val="both"/>
       <w:outlineLvl w:val="2"/>
     </w:pPr>
@@ -1015,29 +1015,26 @@
     <w:semiHidden/>
     <w:unhideWhenUsed/>
   </w:style>
-  <w:style w:type="table" w:default="1" w:styleId="Table">
+  <w:style w:type="table" w:styleId="Table">
     <w:name w:val="Table"/>
     <w:basedOn w:val="TableNormal"/>
-    <w:semiHidden/>
-    <w:unhideWhenUsed/>
-    <w:qFormat/>
     <w:tblPr>
       <w:tblInd w:w="0" w:type="dxa"/>
+      <w:tblBorders>
+        <w:top w:val="single" w:sz="4" w:space="0" w:color="auto"/>
+        <w:left w:val="single" w:sz="4" w:space="0" w:color="auto"/>
+        <w:bottom w:val="single" w:sz="4" w:space="0" w:color="auto"/>
+        <w:right w:val="single" w:sz="4" w:space="0" w:color="auto"/>
+        <w:insideH w:val="single" w:sz="4" w:space="0" w:color="auto"/>
+        <w:insideV w:val="single" w:sz="4" w:space="0" w:color="auto"/>
+      </w:tblBorders>
       <w:tblCellMar>
-        <w:top w:w="0" w:type="dxa"/>
+        <w:top w:w="60" w:type="dxa"/>
         <w:left w:w="108" w:type="dxa"/>
-        <w:bottom w:w="0" w:type="dxa"/>
+        <w:bottom w:w="60" w:type="dxa"/>
         <w:right w:w="108" w:type="dxa"/>
       </w:tblCellMar>
     </w:tblPr>
-    <w:tblStylePr w:type="firstRow">
-      <w:tcPr>
-        <w:tcBorders>
-          <w:bottom w:val="single"/>
-        </w:tcBorders>
-        <w:vAlign w:val="bottom"/>
-      </w:tcPr>
-    </w:tblStylePr>
   </w:style>
   <w:style w:type="paragraph" w:customStyle="1" w:styleId="DefinitionTerm">
     <w:name w:val="Definition Term"/>

</xml_diff>